<commit_message>
some changes in codes
</commit_message>
<xml_diff>
--- a/receive_source/templates_docx/receive_specification_template.docx
+++ b/receive_source/templates_docx/receive_specification_template.docx
@@ -615,12 +615,13 @@
       </w:tblPr>
       <w:tblGrid>
         <w:gridCol w:w="315"/>
-        <w:gridCol w:w="1530"/>
-        <w:gridCol w:w="83"/>
-        <w:gridCol w:w="1087"/>
-        <w:gridCol w:w="630"/>
-        <w:gridCol w:w="182"/>
-        <w:gridCol w:w="985"/>
+        <w:gridCol w:w="1613"/>
+        <w:gridCol w:w="284"/>
+        <w:gridCol w:w="37"/>
+        <w:gridCol w:w="1133"/>
+        <w:gridCol w:w="445"/>
+        <w:gridCol w:w="273"/>
+        <w:gridCol w:w="712"/>
         <w:gridCol w:w="569"/>
         <w:gridCol w:w="6"/>
         <w:gridCol w:w="245"/>
@@ -643,7 +644,7 @@
         <w:tc>
           <w:tcPr>
             <w:tcW w:w="10490" w:type="dxa"/>
-            <w:gridSpan w:val="20"/>
+            <w:gridSpan w:val="21"/>
             <w:tcBorders>
               <w:top w:val="single" w:sz="12" w:space="0" w:color="auto"/>
               <w:bottom w:val="single" w:sz="12" w:space="0" w:color="auto"/>
@@ -696,7 +697,7 @@
         <w:tc>
           <w:tcPr>
             <w:tcW w:w="1928" w:type="dxa"/>
-            <w:gridSpan w:val="3"/>
+            <w:gridSpan w:val="2"/>
             <w:tcBorders>
               <w:top w:val="single" w:sz="12" w:space="0" w:color="auto"/>
               <w:bottom w:val="single" w:sz="4" w:space="0" w:color="auto"/>
@@ -759,7 +760,7 @@
         <w:tc>
           <w:tcPr>
             <w:tcW w:w="3459" w:type="dxa"/>
-            <w:gridSpan w:val="6"/>
+            <w:gridSpan w:val="8"/>
             <w:tcBorders>
               <w:top w:val="single" w:sz="12" w:space="0" w:color="auto"/>
               <w:bottom w:val="single" w:sz="4" w:space="0" w:color="auto"/>
@@ -836,7 +837,7 @@
         <w:tc>
           <w:tcPr>
             <w:tcW w:w="1928" w:type="dxa"/>
-            <w:gridSpan w:val="3"/>
+            <w:gridSpan w:val="2"/>
             <w:tcBorders>
               <w:top w:val="single" w:sz="4" w:space="0" w:color="auto"/>
               <w:bottom w:val="single" w:sz="4" w:space="0" w:color="auto"/>
@@ -889,7 +890,7 @@
         <w:tc>
           <w:tcPr>
             <w:tcW w:w="8562" w:type="dxa"/>
-            <w:gridSpan w:val="17"/>
+            <w:gridSpan w:val="19"/>
             <w:tcBorders>
               <w:top w:val="single" w:sz="4" w:space="0" w:color="auto"/>
               <w:bottom w:val="single" w:sz="4" w:space="0" w:color="auto"/>
@@ -952,7 +953,7 @@
         <w:tc>
           <w:tcPr>
             <w:tcW w:w="3119" w:type="dxa"/>
-            <w:gridSpan w:val="7"/>
+            <w:gridSpan w:val="8"/>
             <w:tcBorders>
               <w:top w:val="single" w:sz="4" w:space="0" w:color="auto"/>
               <w:bottom w:val="single" w:sz="4" w:space="0" w:color="auto"/>
@@ -1042,7 +1043,7 @@
         <w:tc>
           <w:tcPr>
             <w:tcW w:w="10490" w:type="dxa"/>
-            <w:gridSpan w:val="20"/>
+            <w:gridSpan w:val="21"/>
             <w:tcBorders>
               <w:top w:val="single" w:sz="4" w:space="0" w:color="auto"/>
               <w:bottom w:val="single" w:sz="12" w:space="0" w:color="auto"/>
@@ -1059,6 +1060,7 @@
                 <w:sz w:val="24"/>
                 <w:szCs w:val="24"/>
                 <w:rtl/>
+                <w:lang w:bidi="ar-SA"/>
               </w:rPr>
             </w:pPr>
             <w:r>
@@ -1097,8 +1099,9 @@
                 <w:sz w:val="24"/>
                 <w:szCs w:val="24"/>
                 <w:rtl/>
-              </w:rPr>
-              <w:t>:</w:t>
+                <w:lang w:bidi="ar-SA"/>
+              </w:rPr>
+              <w:t xml:space="preserve">  :</w:t>
             </w:r>
           </w:p>
         </w:tc>
@@ -1111,7 +1114,7 @@
         <w:tc>
           <w:tcPr>
             <w:tcW w:w="10490" w:type="dxa"/>
-            <w:gridSpan w:val="20"/>
+            <w:gridSpan w:val="21"/>
             <w:tcBorders>
               <w:top w:val="single" w:sz="12" w:space="0" w:color="auto"/>
               <w:bottom w:val="single" w:sz="12" w:space="0" w:color="auto"/>
@@ -1226,7 +1229,8 @@
         </w:tc>
         <w:tc>
           <w:tcPr>
-            <w:tcW w:w="1530" w:type="dxa"/>
+            <w:tcW w:w="1934" w:type="dxa"/>
+            <w:gridSpan w:val="3"/>
             <w:vMerge w:val="restart"/>
             <w:tcBorders>
               <w:top w:val="single" w:sz="12" w:space="0" w:color="auto"/>
@@ -1270,7 +1274,60 @@
         </w:tc>
         <w:tc>
           <w:tcPr>
-            <w:tcW w:w="1170" w:type="dxa"/>
+            <w:tcW w:w="1133" w:type="dxa"/>
+            <w:vMerge w:val="restart"/>
+            <w:tcBorders>
+              <w:top w:val="single" w:sz="12" w:space="0" w:color="auto"/>
+              <w:bottom w:val="single" w:sz="4" w:space="0" w:color="auto"/>
+            </w:tcBorders>
+            <w:shd w:val="clear" w:color="auto" w:fill="F2F2F2" w:themeFill="background1" w:themeFillShade="F2"/>
+            <w:vAlign w:val="center"/>
+          </w:tcPr>
+          <w:p>
+            <w:pPr>
+              <w:bidi/>
+              <w:ind w:left="-57" w:right="-57"/>
+              <w:jc w:val="center"/>
+              <w:rPr>
+                <w:rFonts w:cs="B Nazanin"/>
+                <w:sz w:val="24"/>
+                <w:szCs w:val="24"/>
+                <w:rtl/>
+              </w:rPr>
+            </w:pPr>
+            <w:r>
+              <w:rPr>
+                <w:rFonts w:cs="B Nazanin" w:hint="cs"/>
+                <w:sz w:val="22"/>
+                <w:szCs w:val="22"/>
+                <w:rtl/>
+                <w:lang w:bidi="ar-SA"/>
+              </w:rPr>
+              <w:t>اکتیویته میانگین (</w:t>
+            </w:r>
+            <w:r>
+              <w:rPr>
+                <w:rFonts w:cs="B Nazanin"/>
+                <w:sz w:val="22"/>
+                <w:szCs w:val="22"/>
+                <w:lang w:bidi="ar-SA"/>
+              </w:rPr>
+              <w:t>mci</w:t>
+            </w:r>
+            <w:r>
+              <w:rPr>
+                <w:rFonts w:cs="B Nazanin" w:hint="cs"/>
+                <w:sz w:val="22"/>
+                <w:szCs w:val="22"/>
+                <w:rtl/>
+              </w:rPr>
+              <w:t>)</w:t>
+            </w:r>
+          </w:p>
+        </w:tc>
+        <w:tc>
+          <w:tcPr>
+            <w:tcW w:w="718" w:type="dxa"/>
             <w:gridSpan w:val="2"/>
             <w:vMerge w:val="restart"/>
             <w:tcBorders>
@@ -1283,13 +1340,12 @@
           <w:p>
             <w:pPr>
               <w:bidi/>
-              <w:ind w:left="-57" w:right="-57"/>
               <w:jc w:val="center"/>
               <w:rPr>
                 <w:rFonts w:cs="B Nazanin"/>
                 <w:sz w:val="24"/>
                 <w:szCs w:val="24"/>
-                <w:rtl/>
+                <w:lang w:bidi="ar-SA"/>
               </w:rPr>
             </w:pPr>
             <w:r>
@@ -1300,66 +1356,13 @@
                 <w:rtl/>
                 <w:lang w:bidi="ar-SA"/>
               </w:rPr>
-              <w:t>اکتیویته میانگین (</w:t>
-            </w:r>
-            <w:r>
-              <w:rPr>
-                <w:rFonts w:cs="B Nazanin"/>
-                <w:sz w:val="22"/>
-                <w:szCs w:val="22"/>
-                <w:lang w:bidi="ar-SA"/>
-              </w:rPr>
-              <w:t>mci</w:t>
-            </w:r>
-            <w:r>
-              <w:rPr>
-                <w:rFonts w:cs="B Nazanin" w:hint="cs"/>
-                <w:sz w:val="22"/>
-                <w:szCs w:val="22"/>
-                <w:rtl/>
-              </w:rPr>
-              <w:t>)</w:t>
-            </w:r>
-          </w:p>
-        </w:tc>
-        <w:tc>
-          <w:tcPr>
-            <w:tcW w:w="630" w:type="dxa"/>
-            <w:vMerge w:val="restart"/>
-            <w:tcBorders>
-              <w:top w:val="single" w:sz="12" w:space="0" w:color="auto"/>
-              <w:bottom w:val="single" w:sz="4" w:space="0" w:color="auto"/>
-            </w:tcBorders>
-            <w:shd w:val="clear" w:color="auto" w:fill="F2F2F2" w:themeFill="background1" w:themeFillShade="F2"/>
-            <w:vAlign w:val="center"/>
-          </w:tcPr>
-          <w:p>
-            <w:pPr>
-              <w:bidi/>
-              <w:jc w:val="center"/>
-              <w:rPr>
-                <w:rFonts w:cs="B Nazanin"/>
-                <w:sz w:val="24"/>
-                <w:szCs w:val="24"/>
-                <w:lang w:bidi="ar-SA"/>
-              </w:rPr>
-            </w:pPr>
-            <w:r>
-              <w:rPr>
-                <w:rFonts w:cs="B Nazanin" w:hint="cs"/>
-                <w:sz w:val="22"/>
-                <w:szCs w:val="22"/>
-                <w:rtl/>
-                <w:lang w:bidi="ar-SA"/>
-              </w:rPr>
               <w:t>تعداد/ مقدار</w:t>
             </w:r>
           </w:p>
         </w:tc>
         <w:tc>
           <w:tcPr>
-            <w:tcW w:w="1167" w:type="dxa"/>
-            <w:gridSpan w:val="2"/>
+            <w:tcW w:w="712" w:type="dxa"/>
             <w:vMerge w:val="restart"/>
             <w:tcBorders>
               <w:top w:val="single" w:sz="12" w:space="0" w:color="auto"/>
@@ -1606,7 +1609,8 @@
         </w:tc>
         <w:tc>
           <w:tcPr>
-            <w:tcW w:w="1530" w:type="dxa"/>
+            <w:tcW w:w="1934" w:type="dxa"/>
+            <w:gridSpan w:val="3"/>
             <w:vMerge/>
             <w:tcBorders>
               <w:top w:val="single" w:sz="4" w:space="0" w:color="auto"/>
@@ -1630,7 +1634,31 @@
         </w:tc>
         <w:tc>
           <w:tcPr>
-            <w:tcW w:w="1170" w:type="dxa"/>
+            <w:tcW w:w="1133" w:type="dxa"/>
+            <w:vMerge/>
+            <w:tcBorders>
+              <w:top w:val="single" w:sz="4" w:space="0" w:color="auto"/>
+              <w:bottom w:val="single" w:sz="4" w:space="0" w:color="auto"/>
+            </w:tcBorders>
+            <w:vAlign w:val="center"/>
+          </w:tcPr>
+          <w:p>
+            <w:pPr>
+              <w:bidi/>
+              <w:jc w:val="center"/>
+              <w:rPr>
+                <w:rFonts w:cs="B Nazanin"/>
+                <w:sz w:val="24"/>
+                <w:szCs w:val="24"/>
+                <w:rtl/>
+                <w:lang w:bidi="ar-SA"/>
+              </w:rPr>
+            </w:pPr>
+          </w:p>
+        </w:tc>
+        <w:tc>
+          <w:tcPr>
+            <w:tcW w:w="718" w:type="dxa"/>
             <w:gridSpan w:val="2"/>
             <w:vMerge/>
             <w:tcBorders>
@@ -1655,32 +1683,7 @@
         </w:tc>
         <w:tc>
           <w:tcPr>
-            <w:tcW w:w="630" w:type="dxa"/>
-            <w:vMerge/>
-            <w:tcBorders>
-              <w:top w:val="single" w:sz="4" w:space="0" w:color="auto"/>
-              <w:bottom w:val="single" w:sz="4" w:space="0" w:color="auto"/>
-            </w:tcBorders>
-            <w:vAlign w:val="center"/>
-          </w:tcPr>
-          <w:p>
-            <w:pPr>
-              <w:bidi/>
-              <w:jc w:val="center"/>
-              <w:rPr>
-                <w:rFonts w:cs="B Nazanin"/>
-                <w:sz w:val="24"/>
-                <w:szCs w:val="24"/>
-                <w:rtl/>
-                <w:lang w:bidi="ar-SA"/>
-              </w:rPr>
-            </w:pPr>
-          </w:p>
-        </w:tc>
-        <w:tc>
-          <w:tcPr>
-            <w:tcW w:w="1167" w:type="dxa"/>
-            <w:gridSpan w:val="2"/>
+            <w:tcW w:w="712" w:type="dxa"/>
             <w:vMerge/>
             <w:tcBorders>
               <w:top w:val="single" w:sz="4" w:space="0" w:color="auto"/>
@@ -1957,30 +1960,54 @@
         </w:tc>
         <w:tc>
           <w:tcPr>
-            <w:tcW w:w="1530" w:type="dxa"/>
-            <w:tcBorders>
-              <w:top w:val="single" w:sz="4" w:space="0" w:color="auto"/>
-              <w:bottom w:val="single" w:sz="4" w:space="0" w:color="auto"/>
-            </w:tcBorders>
-            <w:vAlign w:val="center"/>
-          </w:tcPr>
-          <w:p>
-            <w:pPr>
-              <w:bidi/>
-              <w:jc w:val="left"/>
-              <w:rPr>
-                <w:rFonts w:cs="B Nazanin"/>
-                <w:sz w:val="24"/>
-                <w:szCs w:val="24"/>
-                <w:rtl/>
-                <w:lang w:bidi="ar-SA"/>
-              </w:rPr>
-            </w:pPr>
-          </w:p>
-        </w:tc>
-        <w:tc>
-          <w:tcPr>
-            <w:tcW w:w="1170" w:type="dxa"/>
+            <w:tcW w:w="1934" w:type="dxa"/>
+            <w:gridSpan w:val="3"/>
+            <w:tcBorders>
+              <w:top w:val="single" w:sz="4" w:space="0" w:color="auto"/>
+              <w:bottom w:val="single" w:sz="4" w:space="0" w:color="auto"/>
+            </w:tcBorders>
+            <w:vAlign w:val="center"/>
+          </w:tcPr>
+          <w:p>
+            <w:pPr>
+              <w:bidi/>
+              <w:jc w:val="left"/>
+              <w:rPr>
+                <w:rFonts w:cs="B Nazanin"/>
+                <w:sz w:val="24"/>
+                <w:szCs w:val="24"/>
+                <w:rtl/>
+                <w:lang w:bidi="ar-SA"/>
+              </w:rPr>
+            </w:pPr>
+          </w:p>
+        </w:tc>
+        <w:tc>
+          <w:tcPr>
+            <w:tcW w:w="1133" w:type="dxa"/>
+            <w:tcBorders>
+              <w:top w:val="single" w:sz="4" w:space="0" w:color="auto"/>
+              <w:bottom w:val="single" w:sz="4" w:space="0" w:color="auto"/>
+            </w:tcBorders>
+            <w:vAlign w:val="center"/>
+          </w:tcPr>
+          <w:p>
+            <w:pPr>
+              <w:bidi/>
+              <w:jc w:val="left"/>
+              <w:rPr>
+                <w:rFonts w:cs="B Nazanin"/>
+                <w:sz w:val="24"/>
+                <w:szCs w:val="24"/>
+                <w:rtl/>
+                <w:lang w:bidi="ar-SA"/>
+              </w:rPr>
+            </w:pPr>
+          </w:p>
+        </w:tc>
+        <w:tc>
+          <w:tcPr>
+            <w:tcW w:w="718" w:type="dxa"/>
             <w:gridSpan w:val="2"/>
             <w:tcBorders>
               <w:top w:val="single" w:sz="4" w:space="0" w:color="auto"/>
@@ -2004,31 +2031,7 @@
         </w:tc>
         <w:tc>
           <w:tcPr>
-            <w:tcW w:w="630" w:type="dxa"/>
-            <w:tcBorders>
-              <w:top w:val="single" w:sz="4" w:space="0" w:color="auto"/>
-              <w:bottom w:val="single" w:sz="4" w:space="0" w:color="auto"/>
-            </w:tcBorders>
-            <w:vAlign w:val="center"/>
-          </w:tcPr>
-          <w:p>
-            <w:pPr>
-              <w:bidi/>
-              <w:jc w:val="left"/>
-              <w:rPr>
-                <w:rFonts w:cs="B Nazanin"/>
-                <w:sz w:val="24"/>
-                <w:szCs w:val="24"/>
-                <w:rtl/>
-                <w:lang w:bidi="ar-SA"/>
-              </w:rPr>
-            </w:pPr>
-          </w:p>
-        </w:tc>
-        <w:tc>
-          <w:tcPr>
-            <w:tcW w:w="1167" w:type="dxa"/>
-            <w:gridSpan w:val="2"/>
+            <w:tcW w:w="712" w:type="dxa"/>
             <w:tcBorders>
               <w:top w:val="single" w:sz="4" w:space="0" w:color="auto"/>
               <w:bottom w:val="single" w:sz="4" w:space="0" w:color="auto"/>
@@ -2255,30 +2258,54 @@
         </w:tc>
         <w:tc>
           <w:tcPr>
-            <w:tcW w:w="1530" w:type="dxa"/>
-            <w:tcBorders>
-              <w:top w:val="single" w:sz="4" w:space="0" w:color="auto"/>
-              <w:bottom w:val="single" w:sz="4" w:space="0" w:color="auto"/>
-            </w:tcBorders>
-            <w:vAlign w:val="center"/>
-          </w:tcPr>
-          <w:p>
-            <w:pPr>
-              <w:bidi/>
-              <w:jc w:val="left"/>
-              <w:rPr>
-                <w:rFonts w:cs="B Nazanin"/>
-                <w:sz w:val="24"/>
-                <w:szCs w:val="24"/>
-                <w:rtl/>
-                <w:lang w:bidi="ar-SA"/>
-              </w:rPr>
-            </w:pPr>
-          </w:p>
-        </w:tc>
-        <w:tc>
-          <w:tcPr>
-            <w:tcW w:w="1170" w:type="dxa"/>
+            <w:tcW w:w="1934" w:type="dxa"/>
+            <w:gridSpan w:val="3"/>
+            <w:tcBorders>
+              <w:top w:val="single" w:sz="4" w:space="0" w:color="auto"/>
+              <w:bottom w:val="single" w:sz="4" w:space="0" w:color="auto"/>
+            </w:tcBorders>
+            <w:vAlign w:val="center"/>
+          </w:tcPr>
+          <w:p>
+            <w:pPr>
+              <w:bidi/>
+              <w:jc w:val="left"/>
+              <w:rPr>
+                <w:rFonts w:cs="B Nazanin"/>
+                <w:sz w:val="24"/>
+                <w:szCs w:val="24"/>
+                <w:rtl/>
+                <w:lang w:bidi="ar-SA"/>
+              </w:rPr>
+            </w:pPr>
+          </w:p>
+        </w:tc>
+        <w:tc>
+          <w:tcPr>
+            <w:tcW w:w="1133" w:type="dxa"/>
+            <w:tcBorders>
+              <w:top w:val="single" w:sz="4" w:space="0" w:color="auto"/>
+              <w:bottom w:val="single" w:sz="4" w:space="0" w:color="auto"/>
+            </w:tcBorders>
+            <w:vAlign w:val="center"/>
+          </w:tcPr>
+          <w:p>
+            <w:pPr>
+              <w:bidi/>
+              <w:jc w:val="left"/>
+              <w:rPr>
+                <w:rFonts w:cs="B Nazanin"/>
+                <w:sz w:val="24"/>
+                <w:szCs w:val="24"/>
+                <w:rtl/>
+                <w:lang w:bidi="ar-SA"/>
+              </w:rPr>
+            </w:pPr>
+          </w:p>
+        </w:tc>
+        <w:tc>
+          <w:tcPr>
+            <w:tcW w:w="718" w:type="dxa"/>
             <w:gridSpan w:val="2"/>
             <w:tcBorders>
               <w:top w:val="single" w:sz="4" w:space="0" w:color="auto"/>
@@ -2302,31 +2329,7 @@
         </w:tc>
         <w:tc>
           <w:tcPr>
-            <w:tcW w:w="630" w:type="dxa"/>
-            <w:tcBorders>
-              <w:top w:val="single" w:sz="4" w:space="0" w:color="auto"/>
-              <w:bottom w:val="single" w:sz="4" w:space="0" w:color="auto"/>
-            </w:tcBorders>
-            <w:vAlign w:val="center"/>
-          </w:tcPr>
-          <w:p>
-            <w:pPr>
-              <w:bidi/>
-              <w:jc w:val="left"/>
-              <w:rPr>
-                <w:rFonts w:cs="B Nazanin"/>
-                <w:sz w:val="24"/>
-                <w:szCs w:val="24"/>
-                <w:rtl/>
-                <w:lang w:bidi="ar-SA"/>
-              </w:rPr>
-            </w:pPr>
-          </w:p>
-        </w:tc>
-        <w:tc>
-          <w:tcPr>
-            <w:tcW w:w="1167" w:type="dxa"/>
-            <w:gridSpan w:val="2"/>
+            <w:tcW w:w="712" w:type="dxa"/>
             <w:tcBorders>
               <w:top w:val="single" w:sz="4" w:space="0" w:color="auto"/>
               <w:bottom w:val="single" w:sz="4" w:space="0" w:color="auto"/>
@@ -2553,30 +2556,54 @@
         </w:tc>
         <w:tc>
           <w:tcPr>
-            <w:tcW w:w="1530" w:type="dxa"/>
-            <w:tcBorders>
-              <w:top w:val="single" w:sz="4" w:space="0" w:color="auto"/>
-              <w:bottom w:val="single" w:sz="4" w:space="0" w:color="auto"/>
-            </w:tcBorders>
-            <w:vAlign w:val="center"/>
-          </w:tcPr>
-          <w:p>
-            <w:pPr>
-              <w:bidi/>
-              <w:jc w:val="left"/>
-              <w:rPr>
-                <w:rFonts w:cs="B Nazanin"/>
-                <w:sz w:val="24"/>
-                <w:szCs w:val="24"/>
-                <w:rtl/>
-                <w:lang w:bidi="ar-SA"/>
-              </w:rPr>
-            </w:pPr>
-          </w:p>
-        </w:tc>
-        <w:tc>
-          <w:tcPr>
-            <w:tcW w:w="1170" w:type="dxa"/>
+            <w:tcW w:w="1934" w:type="dxa"/>
+            <w:gridSpan w:val="3"/>
+            <w:tcBorders>
+              <w:top w:val="single" w:sz="4" w:space="0" w:color="auto"/>
+              <w:bottom w:val="single" w:sz="4" w:space="0" w:color="auto"/>
+            </w:tcBorders>
+            <w:vAlign w:val="center"/>
+          </w:tcPr>
+          <w:p>
+            <w:pPr>
+              <w:bidi/>
+              <w:jc w:val="left"/>
+              <w:rPr>
+                <w:rFonts w:cs="B Nazanin"/>
+                <w:sz w:val="24"/>
+                <w:szCs w:val="24"/>
+                <w:rtl/>
+                <w:lang w:bidi="ar-SA"/>
+              </w:rPr>
+            </w:pPr>
+          </w:p>
+        </w:tc>
+        <w:tc>
+          <w:tcPr>
+            <w:tcW w:w="1133" w:type="dxa"/>
+            <w:tcBorders>
+              <w:top w:val="single" w:sz="4" w:space="0" w:color="auto"/>
+              <w:bottom w:val="single" w:sz="4" w:space="0" w:color="auto"/>
+            </w:tcBorders>
+            <w:vAlign w:val="center"/>
+          </w:tcPr>
+          <w:p>
+            <w:pPr>
+              <w:bidi/>
+              <w:jc w:val="left"/>
+              <w:rPr>
+                <w:rFonts w:cs="B Nazanin"/>
+                <w:sz w:val="24"/>
+                <w:szCs w:val="24"/>
+                <w:rtl/>
+                <w:lang w:bidi="ar-SA"/>
+              </w:rPr>
+            </w:pPr>
+          </w:p>
+        </w:tc>
+        <w:tc>
+          <w:tcPr>
+            <w:tcW w:w="718" w:type="dxa"/>
             <w:gridSpan w:val="2"/>
             <w:tcBorders>
               <w:top w:val="single" w:sz="4" w:space="0" w:color="auto"/>
@@ -2600,31 +2627,7 @@
         </w:tc>
         <w:tc>
           <w:tcPr>
-            <w:tcW w:w="630" w:type="dxa"/>
-            <w:tcBorders>
-              <w:top w:val="single" w:sz="4" w:space="0" w:color="auto"/>
-              <w:bottom w:val="single" w:sz="4" w:space="0" w:color="auto"/>
-            </w:tcBorders>
-            <w:vAlign w:val="center"/>
-          </w:tcPr>
-          <w:p>
-            <w:pPr>
-              <w:bidi/>
-              <w:jc w:val="left"/>
-              <w:rPr>
-                <w:rFonts w:cs="B Nazanin"/>
-                <w:sz w:val="24"/>
-                <w:szCs w:val="24"/>
-                <w:rtl/>
-                <w:lang w:bidi="ar-SA"/>
-              </w:rPr>
-            </w:pPr>
-          </w:p>
-        </w:tc>
-        <w:tc>
-          <w:tcPr>
-            <w:tcW w:w="1167" w:type="dxa"/>
-            <w:gridSpan w:val="2"/>
+            <w:tcW w:w="712" w:type="dxa"/>
             <w:tcBorders>
               <w:top w:val="single" w:sz="4" w:space="0" w:color="auto"/>
               <w:bottom w:val="single" w:sz="4" w:space="0" w:color="auto"/>
@@ -2818,18 +2821,17 @@
         <w:tc>
           <w:tcPr>
             <w:tcW w:w="10490" w:type="dxa"/>
-            <w:gridSpan w:val="20"/>
+            <w:gridSpan w:val="21"/>
             <w:tcBorders>
               <w:top w:val="single" w:sz="12" w:space="0" w:color="auto"/>
               <w:bottom w:val="single" w:sz="12" w:space="0" w:color="auto"/>
             </w:tcBorders>
             <w:shd w:val="clear" w:color="auto" w:fill="F2F2F2"/>
-            <w:vAlign w:val="center"/>
-          </w:tcPr>
-          <w:p>
-            <w:pPr>
-              <w:bidi/>
-              <w:jc w:val="center"/>
+          </w:tcPr>
+          <w:p>
+            <w:pPr>
+              <w:bidi/>
+              <w:jc w:val="left"/>
               <w:rPr>
                 <w:b/>
                 <w:bCs/>
@@ -2849,11 +2851,22 @@
               </w:rPr>
               <w:t xml:space="preserve">بازدید قبل از عملیات:               </w:t>
             </w:r>
-          </w:p>
-          <w:p>
-            <w:pPr>
-              <w:bidi/>
-              <w:jc w:val="center"/>
+            <w:r>
+              <w:rPr>
+                <w:rFonts w:cs="B Nazanin" w:hint="cs"/>
+                <w:b/>
+                <w:bCs/>
+                <w:sz w:val="22"/>
+                <w:szCs w:val="22"/>
+                <w:rtl/>
+              </w:rPr>
+              <w:t xml:space="preserve"> </w:t>
+            </w:r>
+          </w:p>
+          <w:p>
+            <w:pPr>
+              <w:bidi/>
+              <w:jc w:val="left"/>
               <w:rPr>
                 <w:rFonts w:cs="B Nazanin"/>
                 <w:b/>
@@ -2874,7 +2887,7 @@
         <w:tc>
           <w:tcPr>
             <w:tcW w:w="5632" w:type="dxa"/>
-            <w:gridSpan w:val="10"/>
+            <w:gridSpan w:val="11"/>
             <w:tcBorders>
               <w:top w:val="single" w:sz="4" w:space="0" w:color="auto"/>
             </w:tcBorders>
@@ -2901,7 +2914,7 @@
                 <w:rtl/>
                 <w:lang w:bidi="ar-SA"/>
               </w:rPr>
-              <w:t xml:space="preserve">تعداد پرسنل اعزامی </w:t>
+              <w:t xml:space="preserve">تعداد پرسنل اعزامی:   </w:t>
             </w:r>
           </w:p>
         </w:tc>
@@ -2937,6 +2950,15 @@
                 <w:lang w:bidi="ar-SA"/>
               </w:rPr>
               <w:t xml:space="preserve">تعداد روز ماموریت: </w:t>
+            </w:r>
+            <w:r>
+              <w:rPr>
+                <w:rFonts w:cs="B Nazanin"/>
+                <w:sz w:val="24"/>
+                <w:szCs w:val="24"/>
+                <w:lang w:bidi="ar-SA"/>
+              </w:rPr>
+              <w:t xml:space="preserve">    </w:t>
             </w:r>
           </w:p>
         </w:tc>
@@ -2949,7 +2971,7 @@
         <w:tc>
           <w:tcPr>
             <w:tcW w:w="10490" w:type="dxa"/>
-            <w:gridSpan w:val="20"/>
+            <w:gridSpan w:val="21"/>
             <w:tcBorders>
               <w:bottom w:val="single" w:sz="12" w:space="0" w:color="auto"/>
             </w:tcBorders>
@@ -2989,7 +3011,7 @@
         <w:tc>
           <w:tcPr>
             <w:tcW w:w="10490" w:type="dxa"/>
-            <w:gridSpan w:val="20"/>
+            <w:gridSpan w:val="21"/>
             <w:tcBorders>
               <w:top w:val="single" w:sz="12" w:space="0" w:color="auto"/>
               <w:bottom w:val="single" w:sz="4" w:space="0" w:color="auto"/>
@@ -3030,8 +3052,8 @@
         </w:trPr>
         <w:tc>
           <w:tcPr>
-            <w:tcW w:w="1845" w:type="dxa"/>
-            <w:gridSpan w:val="2"/>
+            <w:tcW w:w="2212" w:type="dxa"/>
+            <w:gridSpan w:val="3"/>
             <w:tcBorders>
               <w:top w:val="single" w:sz="4" w:space="0" w:color="auto"/>
               <w:bottom w:val="single" w:sz="4" w:space="0" w:color="auto"/>
@@ -3064,7 +3086,7 @@
         </w:tc>
         <w:tc>
           <w:tcPr>
-            <w:tcW w:w="3787" w:type="dxa"/>
+            <w:tcW w:w="3420" w:type="dxa"/>
             <w:gridSpan w:val="8"/>
             <w:tcBorders>
               <w:top w:val="single" w:sz="4" w:space="0" w:color="auto"/>
@@ -3152,8 +3174,8 @@
         </w:trPr>
         <w:tc>
           <w:tcPr>
-            <w:tcW w:w="1845" w:type="dxa"/>
-            <w:gridSpan w:val="2"/>
+            <w:tcW w:w="2212" w:type="dxa"/>
+            <w:gridSpan w:val="3"/>
             <w:tcBorders>
               <w:top w:val="single" w:sz="4" w:space="0" w:color="auto"/>
               <w:bottom w:val="single" w:sz="4" w:space="0" w:color="auto"/>
@@ -3187,7 +3209,7 @@
         </w:tc>
         <w:tc>
           <w:tcPr>
-            <w:tcW w:w="3787" w:type="dxa"/>
+            <w:tcW w:w="3420" w:type="dxa"/>
             <w:gridSpan w:val="8"/>
             <w:tcBorders>
               <w:top w:val="single" w:sz="4" w:space="0" w:color="auto"/>
@@ -3275,8 +3297,8 @@
         </w:trPr>
         <w:tc>
           <w:tcPr>
-            <w:tcW w:w="1845" w:type="dxa"/>
-            <w:gridSpan w:val="2"/>
+            <w:tcW w:w="2212" w:type="dxa"/>
+            <w:gridSpan w:val="3"/>
             <w:tcBorders>
               <w:top w:val="single" w:sz="4" w:space="0" w:color="auto"/>
               <w:bottom w:val="single" w:sz="4" w:space="0" w:color="auto"/>
@@ -3318,7 +3340,7 @@
         </w:tc>
         <w:tc>
           <w:tcPr>
-            <w:tcW w:w="3787" w:type="dxa"/>
+            <w:tcW w:w="3420" w:type="dxa"/>
             <w:gridSpan w:val="8"/>
             <w:tcBorders>
               <w:top w:val="single" w:sz="4" w:space="0" w:color="auto"/>
@@ -3401,8 +3423,8 @@
         </w:trPr>
         <w:tc>
           <w:tcPr>
-            <w:tcW w:w="1845" w:type="dxa"/>
-            <w:gridSpan w:val="2"/>
+            <w:tcW w:w="2212" w:type="dxa"/>
+            <w:gridSpan w:val="3"/>
             <w:tcBorders>
               <w:top w:val="single" w:sz="4" w:space="0" w:color="auto"/>
               <w:left w:val="single" w:sz="12" w:space="0" w:color="auto"/>
@@ -3438,7 +3460,7 @@
         </w:tc>
         <w:tc>
           <w:tcPr>
-            <w:tcW w:w="3787" w:type="dxa"/>
+            <w:tcW w:w="3420" w:type="dxa"/>
             <w:gridSpan w:val="8"/>
             <w:tcBorders>
               <w:top w:val="single" w:sz="4" w:space="0" w:color="auto"/>
@@ -3538,8 +3560,8 @@
         </w:trPr>
         <w:tc>
           <w:tcPr>
-            <w:tcW w:w="1845" w:type="dxa"/>
-            <w:gridSpan w:val="2"/>
+            <w:tcW w:w="2212" w:type="dxa"/>
+            <w:gridSpan w:val="3"/>
             <w:tcBorders>
               <w:top w:val="single" w:sz="4" w:space="0" w:color="auto"/>
               <w:left w:val="single" w:sz="12" w:space="0" w:color="auto"/>
@@ -3573,7 +3595,7 @@
         </w:tc>
         <w:tc>
           <w:tcPr>
-            <w:tcW w:w="8645" w:type="dxa"/>
+            <w:tcW w:w="8278" w:type="dxa"/>
             <w:gridSpan w:val="18"/>
             <w:tcBorders>
               <w:top w:val="single" w:sz="4" w:space="0" w:color="auto"/>
@@ -3602,8 +3624,8 @@
         </w:trPr>
         <w:tc>
           <w:tcPr>
-            <w:tcW w:w="1845" w:type="dxa"/>
-            <w:gridSpan w:val="2"/>
+            <w:tcW w:w="2212" w:type="dxa"/>
+            <w:gridSpan w:val="3"/>
             <w:tcBorders>
               <w:top w:val="single" w:sz="4" w:space="0" w:color="auto"/>
               <w:bottom w:val="single" w:sz="4" w:space="0" w:color="auto"/>
@@ -3629,7 +3651,7 @@
         </w:tc>
         <w:tc>
           <w:tcPr>
-            <w:tcW w:w="3787" w:type="dxa"/>
+            <w:tcW w:w="3420" w:type="dxa"/>
             <w:gridSpan w:val="8"/>
             <w:tcBorders>
               <w:top w:val="single" w:sz="4" w:space="0" w:color="auto"/>
@@ -3745,8 +3767,8 @@
         </w:trPr>
         <w:tc>
           <w:tcPr>
-            <w:tcW w:w="1845" w:type="dxa"/>
-            <w:gridSpan w:val="2"/>
+            <w:tcW w:w="2212" w:type="dxa"/>
+            <w:gridSpan w:val="3"/>
             <w:tcBorders>
               <w:top w:val="single" w:sz="4" w:space="0" w:color="auto"/>
               <w:bottom w:val="single" w:sz="12" w:space="0" w:color="auto"/>
@@ -3793,7 +3815,7 @@
         </w:tc>
         <w:tc>
           <w:tcPr>
-            <w:tcW w:w="3787" w:type="dxa"/>
+            <w:tcW w:w="3420" w:type="dxa"/>
             <w:gridSpan w:val="8"/>
             <w:tcBorders>
               <w:top w:val="single" w:sz="4" w:space="0" w:color="auto"/>
@@ -3893,7 +3915,7 @@
         <w:tc>
           <w:tcPr>
             <w:tcW w:w="10490" w:type="dxa"/>
-            <w:gridSpan w:val="20"/>
+            <w:gridSpan w:val="21"/>
             <w:tcBorders>
               <w:top w:val="single" w:sz="12" w:space="0" w:color="auto"/>
               <w:bottom w:val="single" w:sz="12" w:space="0" w:color="auto"/>
@@ -4031,8 +4053,8 @@
             </w:tblPr>
             <w:tblGrid>
               <w:gridCol w:w="3554"/>
-              <w:gridCol w:w="2976"/>
-              <w:gridCol w:w="1134"/>
+              <w:gridCol w:w="2574"/>
+              <w:gridCol w:w="1536"/>
               <w:gridCol w:w="2567"/>
             </w:tblGrid>
             <w:tr>
@@ -4053,7 +4075,7 @@
               </w:tc>
               <w:tc>
                 <w:tcPr>
-                  <w:tcW w:w="2976" w:type="dxa"/>
+                  <w:tcW w:w="2574" w:type="dxa"/>
                   <w:shd w:val="clear" w:color="auto" w:fill="D9D9D9" w:themeFill="background1" w:themeFillShade="D9"/>
                 </w:tcPr>
                 <w:p>
@@ -4080,7 +4102,7 @@
               </w:tc>
               <w:tc>
                 <w:tcPr>
-                  <w:tcW w:w="1134" w:type="dxa"/>
+                  <w:tcW w:w="1536" w:type="dxa"/>
                   <w:shd w:val="clear" w:color="auto" w:fill="D9D9D9" w:themeFill="background1" w:themeFillShade="D9"/>
                 </w:tcPr>
                 <w:p>
@@ -4179,7 +4201,7 @@
               </w:tc>
               <w:tc>
                 <w:tcPr>
-                  <w:tcW w:w="2976" w:type="dxa"/>
+                  <w:tcW w:w="2574" w:type="dxa"/>
                 </w:tcPr>
                 <w:p>
                   <w:pPr>
@@ -4193,7 +4215,7 @@
               </w:tc>
               <w:tc>
                 <w:tcPr>
-                  <w:tcW w:w="1134" w:type="dxa"/>
+                  <w:tcW w:w="1536" w:type="dxa"/>
                 </w:tcPr>
                 <w:p>
                   <w:pPr>
@@ -4273,7 +4295,7 @@
               </w:tc>
               <w:tc>
                 <w:tcPr>
-                  <w:tcW w:w="2976" w:type="dxa"/>
+                  <w:tcW w:w="2574" w:type="dxa"/>
                 </w:tcPr>
                 <w:p>
                   <w:pPr>
@@ -4287,7 +4309,7 @@
               </w:tc>
               <w:tc>
                 <w:tcPr>
-                  <w:tcW w:w="1134" w:type="dxa"/>
+                  <w:tcW w:w="1536" w:type="dxa"/>
                 </w:tcPr>
                 <w:p>
                   <w:pPr>
@@ -4369,7 +4391,7 @@
               </w:tc>
               <w:tc>
                 <w:tcPr>
-                  <w:tcW w:w="2976" w:type="dxa"/>
+                  <w:tcW w:w="2574" w:type="dxa"/>
                 </w:tcPr>
                 <w:p>
                   <w:pPr>
@@ -4383,7 +4405,7 @@
               </w:tc>
               <w:tc>
                 <w:tcPr>
-                  <w:tcW w:w="1134" w:type="dxa"/>
+                  <w:tcW w:w="1536" w:type="dxa"/>
                 </w:tcPr>
                 <w:p>
                   <w:pPr>
@@ -4464,7 +4486,7 @@
               </w:tc>
               <w:tc>
                 <w:tcPr>
-                  <w:tcW w:w="2976" w:type="dxa"/>
+                  <w:tcW w:w="2574" w:type="dxa"/>
                 </w:tcPr>
                 <w:p>
                   <w:pPr>
@@ -4478,7 +4500,7 @@
               </w:tc>
               <w:tc>
                 <w:tcPr>
-                  <w:tcW w:w="1134" w:type="dxa"/>
+                  <w:tcW w:w="1536" w:type="dxa"/>
                 </w:tcPr>
                 <w:p>
                   <w:pPr>
@@ -4529,7 +4551,7 @@
               </w:tc>
               <w:tc>
                 <w:tcPr>
-                  <w:tcW w:w="2976" w:type="dxa"/>
+                  <w:tcW w:w="2574" w:type="dxa"/>
                 </w:tcPr>
                 <w:p>
                   <w:pPr>
@@ -4543,7 +4565,7 @@
               </w:tc>
               <w:tc>
                 <w:tcPr>
-                  <w:tcW w:w="1134" w:type="dxa"/>
+                  <w:tcW w:w="1536" w:type="dxa"/>
                 </w:tcPr>
                 <w:p>
                   <w:pPr>
@@ -4605,7 +4627,7 @@
               </w:tc>
               <w:tc>
                 <w:tcPr>
-                  <w:tcW w:w="2976" w:type="dxa"/>
+                  <w:tcW w:w="2574" w:type="dxa"/>
                 </w:tcPr>
                 <w:p>
                   <w:pPr>
@@ -4619,7 +4641,7 @@
               </w:tc>
               <w:tc>
                 <w:tcPr>
-                  <w:tcW w:w="1134" w:type="dxa"/>
+                  <w:tcW w:w="1536" w:type="dxa"/>
                 </w:tcPr>
                 <w:p>
                   <w:pPr>

</xml_diff>